<commit_message>
Simplify code comments in the final notebook and update the report figures
Co-Authored-By: Claude Opus 5.5 <noreply@anthropic.com>
Claude-Session: https://claude.ai/code/session_01FuKupHrS6yidq12N9G7ME8
</commit_message>
<xml_diff>
--- a/report/Hotel_Booking_Report.docx
+++ b/report/Hotel_Booking_Report.docx
@@ -1232,7 +1232,7 @@
       <w:r>
         <w:drawing>
           <wp:inline xmlns:a="http://schemas.openxmlformats.org/drawingml/2006/main" xmlns:pic="http://schemas.openxmlformats.org/drawingml/2006/picture">
-            <wp:extent cx="5220000" cy="3110909"/>
+            <wp:extent cx="5220000" cy="3449149"/>
             <wp:docPr id="4" name="Picture 4"/>
             <wp:cNvGraphicFramePr>
               <a:graphicFrameLocks noChangeAspect="1"/>
@@ -1253,7 +1253,7 @@
                   <pic:spPr>
                     <a:xfrm>
                       <a:off x="0" y="0"/>
-                      <a:ext cx="5220000" cy="3110909"/>
+                      <a:ext cx="5220000" cy="3449149"/>
                     </a:xfrm>
                     <a:prstGeom prst="rect"/>
                   </pic:spPr>

</xml_diff>